<commit_message>
appointments táblába delivery_method és service_urgency adattagok, ezek miatt appointmentModel.js és appointmentController.js frissítése, nézet oldalon profile.ejs, appointmentTime.ejs, appointmentData.ejs, admin/userPage.ejs, admin/appointments.ejs frissítése. (Fixed #10)
</commit_message>
<xml_diff>
--- a/documents/sipos-motorservice.docx
+++ b/documents/sipos-motorservice.docx
@@ -134,10 +134,12 @@
         <w:t xml:space="preserve">). Ilyenkor a </w:t>
       </w:r>
       <w:proofErr w:type="spellStart"/>
+      <w:proofErr w:type="gramStart"/>
       <w:r>
         <w:t>package.json</w:t>
       </w:r>
       <w:proofErr w:type="spellEnd"/>
+      <w:proofErr w:type="gramEnd"/>
       <w:r>
         <w:t xml:space="preserve"> fájlban be kell állítani a normál („start”: „</w:t>
       </w:r>
@@ -207,13 +209,18 @@
       </w:r>
       <w:proofErr w:type="spellEnd"/>
       <w:r>
-        <w:t>’ parancsokkal lehet futtatni ezeket a módokat. Létrehozok egy .</w:t>
+        <w:t xml:space="preserve">’ parancsokkal lehet futtatni ezeket a módokat. Létrehozok </w:t>
+      </w:r>
+      <w:proofErr w:type="gramStart"/>
+      <w:r>
+        <w:t>egy .</w:t>
       </w:r>
       <w:proofErr w:type="spellStart"/>
       <w:r>
         <w:t>gitignore</w:t>
       </w:r>
       <w:proofErr w:type="spellEnd"/>
+      <w:proofErr w:type="gramEnd"/>
       <w:r>
         <w:t xml:space="preserve"> fájlt, amibe azokat a fájlokat/mappákat írom, amiket nem akarok </w:t>
       </w:r>
@@ -301,7 +308,15 @@
       </w:r>
       <w:proofErr w:type="spellEnd"/>
       <w:r>
-        <w:t xml:space="preserve"> add . =&gt; hozzáadja</w:t>
+        <w:t xml:space="preserve"> </w:t>
+      </w:r>
+      <w:proofErr w:type="gramStart"/>
+      <w:r>
+        <w:t>add .</w:t>
+      </w:r>
+      <w:proofErr w:type="gramEnd"/>
+      <w:r>
+        <w:t xml:space="preserve"> =&gt; hozzáadja</w:t>
       </w:r>
     </w:p>
     <w:p>
@@ -493,10 +508,12 @@
         <w:t xml:space="preserve">/server.js fájlt. Fontos, hogy a </w:t>
       </w:r>
       <w:proofErr w:type="spellStart"/>
+      <w:proofErr w:type="gramStart"/>
       <w:r>
         <w:t>package.json</w:t>
       </w:r>
       <w:proofErr w:type="spellEnd"/>
+      <w:proofErr w:type="gramEnd"/>
       <w:r>
         <w:t xml:space="preserve"> fájlban a </w:t>
       </w:r>
@@ -771,8 +788,13 @@
       </w:r>
       <w:proofErr w:type="spellEnd"/>
       <w:r>
-        <w:t xml:space="preserve"> fülön létre lehet hozni az adattáblákat SQL-el</w:t>
-      </w:r>
+        <w:t xml:space="preserve"> fülön létre lehet hozni az adattáblákat </w:t>
+      </w:r>
+      <w:proofErr w:type="gramStart"/>
+      <w:r>
+        <w:t>SQL-el</w:t>
+      </w:r>
+      <w:proofErr w:type="gramEnd"/>
       <w:r>
         <w:t>.</w:t>
       </w:r>
@@ -960,20 +982,30 @@
         <w:t xml:space="preserve">-ben vannak azok a függvények, amelyek az adatbázissal foglalkoznak, például </w:t>
       </w:r>
       <w:proofErr w:type="spellStart"/>
+      <w:proofErr w:type="gramStart"/>
       <w:r>
         <w:t>findUserByEmail</w:t>
       </w:r>
       <w:proofErr w:type="spellEnd"/>
       <w:r>
-        <w:t xml:space="preserve">() vagy </w:t>
-      </w:r>
-      <w:proofErr w:type="spellStart"/>
+        <w:t>(</w:t>
+      </w:r>
+      <w:proofErr w:type="gramEnd"/>
+      <w:r>
+        <w:t xml:space="preserve">) vagy </w:t>
+      </w:r>
+      <w:proofErr w:type="spellStart"/>
+      <w:proofErr w:type="gramStart"/>
       <w:r>
         <w:t>createUser</w:t>
       </w:r>
       <w:proofErr w:type="spellEnd"/>
       <w:r>
-        <w:t xml:space="preserve">(). Ezek csak dolgoznak az eredménnyel, nem csinálnak semmi mást. A </w:t>
+        <w:t>(</w:t>
+      </w:r>
+      <w:proofErr w:type="gramEnd"/>
+      <w:r>
+        <w:t xml:space="preserve">). Ezek csak dolgoznak az eredménnyel, nem csinálnak semmi mást. A </w:t>
       </w:r>
       <w:proofErr w:type="spellStart"/>
       <w:r>
@@ -1230,10 +1262,12 @@
         <w:t xml:space="preserve"> (</w:t>
       </w:r>
       <w:proofErr w:type="spellStart"/>
+      <w:proofErr w:type="gramStart"/>
       <w:r>
         <w:t>res.redirect</w:t>
       </w:r>
       <w:proofErr w:type="spellEnd"/>
+      <w:proofErr w:type="gramEnd"/>
       <w:r>
         <w:t>(„/”)) oldal.</w:t>
       </w:r>
@@ -1687,12 +1721,17 @@
         <w:t xml:space="preserve"> lista segítségével (</w:t>
       </w:r>
       <w:proofErr w:type="spellStart"/>
+      <w:proofErr w:type="gramStart"/>
       <w:r>
         <w:t>render</w:t>
       </w:r>
       <w:proofErr w:type="spellEnd"/>
       <w:r>
-        <w:t>(„</w:t>
+        <w:t>(</w:t>
+      </w:r>
+      <w:proofErr w:type="gramEnd"/>
+      <w:r>
+        <w:t>„</w:t>
       </w:r>
       <w:proofErr w:type="spellStart"/>
       <w:r>
@@ -1838,6 +1877,7 @@
       <w:r>
         <w:t xml:space="preserve">.body.id nem jó, mindenképp const </w:t>
       </w:r>
+      <w:proofErr w:type="gramStart"/>
       <w:r>
         <w:t>{</w:t>
       </w:r>
@@ -1849,14 +1889,17 @@
         <w:t>id</w:t>
       </w:r>
       <w:proofErr w:type="spellEnd"/>
+      <w:proofErr w:type="gramEnd"/>
       <w:r>
         <w:t xml:space="preserve"> } = </w:t>
       </w:r>
       <w:proofErr w:type="spellStart"/>
+      <w:proofErr w:type="gramStart"/>
       <w:r>
         <w:t>req.params</w:t>
       </w:r>
       <w:proofErr w:type="spellEnd"/>
+      <w:proofErr w:type="gramEnd"/>
       <w:r>
         <w:t xml:space="preserve"> </w:t>
       </w:r>
@@ -2102,9 +2145,11 @@
         <w:t>services</w:t>
       </w:r>
       <w:proofErr w:type="spellEnd"/>
+      <w:proofErr w:type="gramStart"/>
       <w:r>
         <w:t>/:id.</w:t>
       </w:r>
+      <w:proofErr w:type="gramEnd"/>
       <w:r>
         <w:t xml:space="preserve"> Ha GET-el és POST-</w:t>
       </w:r>
@@ -2410,31 +2455,49 @@
         <w:t>nyomással betöltse onnan a szükséges adatokat</w:t>
       </w:r>
       <w:r>
-        <w:t xml:space="preserve"> Ez MÉG NINCS MEGVALÓSÍTVA!</w:t>
-      </w:r>
-      <w:r>
-        <w:t>, és Befejezés gombbal megerősítheti a foglalást. Ekkor majd kap egy email-t is, de ezt később.</w:t>
-      </w:r>
-    </w:p>
-    <w:p>
-      <w:r>
-        <w:t>Fontos, hogy a .</w:t>
+        <w:t xml:space="preserve"> Ez MÉG NINCS </w:t>
+      </w:r>
+      <w:proofErr w:type="gramStart"/>
+      <w:r>
+        <w:t>MEGVALÓSÍTVA!</w:t>
+      </w:r>
+      <w:r>
+        <w:t>,</w:t>
+      </w:r>
+      <w:proofErr w:type="gramEnd"/>
+      <w:r>
+        <w:t xml:space="preserve"> és Befejezés gombbal megerősítheti a foglalást. Ekkor majd kap egy email-t is, de ezt később.</w:t>
+      </w:r>
+    </w:p>
+    <w:p>
+      <w:r>
+        <w:t xml:space="preserve">Fontos, hogy </w:t>
+      </w:r>
+      <w:proofErr w:type="gramStart"/>
+      <w:r>
+        <w:t>a .</w:t>
       </w:r>
       <w:proofErr w:type="spellStart"/>
       <w:r>
         <w:t>ejs</w:t>
       </w:r>
       <w:proofErr w:type="spellEnd"/>
+      <w:proofErr w:type="gramEnd"/>
       <w:r>
         <w:t xml:space="preserve"> fájl a </w:t>
       </w:r>
       <w:proofErr w:type="spellStart"/>
+      <w:proofErr w:type="gramStart"/>
       <w:r>
         <w:t>render</w:t>
       </w:r>
       <w:proofErr w:type="spellEnd"/>
       <w:r>
-        <w:t>()-ben kapcsolódik a kódba (ugyanaz a név kell).</w:t>
+        <w:t>(</w:t>
+      </w:r>
+      <w:proofErr w:type="gramEnd"/>
+      <w:r>
+        <w:t>)-ben kapcsolódik a kódba (ugyanaz a név kell).</w:t>
       </w:r>
     </w:p>
     <w:p>
@@ -2923,20 +2986,30 @@
         <w:t xml:space="preserve">és egy </w:t>
       </w:r>
       <w:proofErr w:type="spellStart"/>
+      <w:proofErr w:type="gramStart"/>
       <w:r>
         <w:t>updateAppointment</w:t>
       </w:r>
       <w:proofErr w:type="spellEnd"/>
       <w:r>
-        <w:t xml:space="preserve">() és </w:t>
-      </w:r>
-      <w:proofErr w:type="spellStart"/>
+        <w:t>(</w:t>
+      </w:r>
+      <w:proofErr w:type="gramEnd"/>
+      <w:r>
+        <w:t xml:space="preserve">) és </w:t>
+      </w:r>
+      <w:proofErr w:type="spellStart"/>
+      <w:proofErr w:type="gramStart"/>
       <w:r>
         <w:t>updateAnAppointment</w:t>
       </w:r>
       <w:proofErr w:type="spellEnd"/>
       <w:r>
-        <w:t>() metódust írni az appointmentModel.js-be és appointmentController.js-be.</w:t>
+        <w:t>(</w:t>
+      </w:r>
+      <w:proofErr w:type="gramEnd"/>
+      <w:r>
+        <w:t>) metódust írni az appointmentModel.js-be és appointmentController.js-be.</w:t>
       </w:r>
     </w:p>
     <w:p>
@@ -3162,7 +3235,15 @@
       </w:r>
       <w:proofErr w:type="spellEnd"/>
       <w:r>
-        <w:t xml:space="preserve">-t (ugyan úgy mint </w:t>
+        <w:t xml:space="preserve">-t (ugyan </w:t>
+      </w:r>
+      <w:proofErr w:type="gramStart"/>
+      <w:r>
+        <w:t>úgy</w:t>
+      </w:r>
+      <w:proofErr w:type="gramEnd"/>
+      <w:r>
+        <w:t xml:space="preserve"> mint </w:t>
       </w:r>
       <w:proofErr w:type="spellStart"/>
       <w:r>
@@ -3416,6 +3497,7 @@
         <w:t xml:space="preserve">, </w:t>
       </w:r>
       <w:proofErr w:type="spellStart"/>
+      <w:proofErr w:type="gramStart"/>
       <w:r>
         <w:t>appointmentData.ejs</w:t>
       </w:r>
@@ -3431,6 +3513,7 @@
         <w:t>profile.ejs</w:t>
       </w:r>
       <w:proofErr w:type="spellEnd"/>
+      <w:proofErr w:type="gramEnd"/>
       <w:r>
         <w:t xml:space="preserve">, </w:t>
       </w:r>
@@ -3718,10 +3801,12 @@
         <w:t xml:space="preserve"> láthatja (</w:t>
       </w:r>
       <w:proofErr w:type="spellStart"/>
+      <w:proofErr w:type="gramStart"/>
       <w:r>
         <w:t>adminController,js</w:t>
       </w:r>
       <w:proofErr w:type="spellEnd"/>
+      <w:proofErr w:type="gramEnd"/>
       <w:r>
         <w:t xml:space="preserve">-ben amúgy már megvan adva a lista, csak a </w:t>
       </w:r>
@@ -3744,7 +3829,17 @@
     </w:p>
     <w:p/>
     <w:p>
-      <w:r>
+      <w:pPr>
+        <w:rPr>
+          <w:b/>
+          <w:bCs/>
+        </w:rPr>
+      </w:pPr>
+      <w:r>
+        <w:rPr>
+          <w:b/>
+          <w:bCs/>
+        </w:rPr>
         <w:t>14. #9</w:t>
       </w:r>
     </w:p>
@@ -3762,7 +3857,28 @@
         <w:t>az input mezőket adatbázis alapján, legördülő listából kell kiválasztani</w:t>
       </w:r>
       <w:r>
-        <w:t>, ahol márkától függ a modell és modelltől függ a típus és kategória</w:t>
+        <w:t>, ahol</w:t>
+      </w:r>
+      <w:r>
+        <w:t xml:space="preserve"> kategóriától függ</w:t>
+      </w:r>
+      <w:r>
+        <w:t xml:space="preserve"> már</w:t>
+      </w:r>
+      <w:r>
+        <w:t>ka, attól</w:t>
+      </w:r>
+      <w:r>
+        <w:t xml:space="preserve"> függ a modell és </w:t>
+      </w:r>
+      <w:r>
+        <w:t>attól</w:t>
+      </w:r>
+      <w:r>
+        <w:t xml:space="preserve"> függ a </w:t>
+      </w:r>
+      <w:r>
+        <w:t>típus</w:t>
       </w:r>
       <w:r>
         <w:t>.</w:t>
@@ -3776,7 +3892,53 @@
       </w:r>
       <w:proofErr w:type="spellEnd"/>
       <w:r>
-        <w:t xml:space="preserve"> néven, ami egy termék katalógus / referencia adatmodell. Tartalmazza egy motor adatait, ezáltal benne lehetnek a lehetséges kombinációk (nem kell külön minden adattagnak külön táblát létrehozni). </w:t>
+        <w:t xml:space="preserve"> néven, ami egy termék katalógus / referencia adatmodell. Tartalmazza egy motor adatait</w:t>
+      </w:r>
+      <w:r>
+        <w:t xml:space="preserve"> (</w:t>
+      </w:r>
+      <w:proofErr w:type="spellStart"/>
+      <w:r>
+        <w:t>category</w:t>
+      </w:r>
+      <w:proofErr w:type="spellEnd"/>
+      <w:r>
+        <w:t xml:space="preserve">, </w:t>
+      </w:r>
+      <w:proofErr w:type="spellStart"/>
+      <w:r>
+        <w:t>brand</w:t>
+      </w:r>
+      <w:proofErr w:type="spellEnd"/>
+      <w:r>
+        <w:t xml:space="preserve">, </w:t>
+      </w:r>
+      <w:proofErr w:type="spellStart"/>
+      <w:r>
+        <w:t>model</w:t>
+      </w:r>
+      <w:proofErr w:type="spellEnd"/>
+      <w:r>
+        <w:t xml:space="preserve">, </w:t>
+      </w:r>
+      <w:proofErr w:type="spellStart"/>
+      <w:r>
+        <w:t>cylinder</w:t>
+      </w:r>
+      <w:proofErr w:type="spellEnd"/>
+      <w:r>
+        <w:t xml:space="preserve">, stroke, </w:t>
+      </w:r>
+      <w:proofErr w:type="spellStart"/>
+      <w:r>
+        <w:t>generation</w:t>
+      </w:r>
+      <w:proofErr w:type="spellEnd"/>
+      <w:r>
+        <w:t>)</w:t>
+      </w:r>
+      <w:r>
+        <w:t xml:space="preserve">, ezáltal benne lehetnek a lehetséges kombinációk (nem kell külön minden adattagnak külön táblát létrehozni). </w:t>
       </w:r>
       <w:r>
         <w:t xml:space="preserve">Módosítottam a </w:t>
@@ -3787,7 +3949,13 @@
       </w:r>
       <w:proofErr w:type="spellEnd"/>
       <w:r>
-        <w:t xml:space="preserve"> táblát is, az adattagok helyett egy </w:t>
+        <w:t xml:space="preserve"> táblát is, </w:t>
+      </w:r>
+      <w:r>
+        <w:t>ahol a motor</w:t>
+      </w:r>
+      <w:r>
+        <w:t xml:space="preserve"> adattagok helyett egy </w:t>
       </w:r>
       <w:proofErr w:type="spellStart"/>
       <w:r>
@@ -3797,115 +3965,302 @@
       <w:r>
         <w:t xml:space="preserve"> van.</w:t>
       </w:r>
-    </w:p>
-    <w:p>
-      <w:r>
-        <w:t xml:space="preserve">Létrehoztam egy catalogModel.js-t, catalogController.js-t és módosítottam a bikeModel.js-t. </w:t>
-      </w:r>
-      <w:r>
-        <w:t xml:space="preserve">A catalogController.js minden metódusa JSON választ ad vissza, mivel így hatékonyabb a kezelés, a </w:t>
-      </w:r>
-      <w:proofErr w:type="spellStart"/>
-      <w:r>
-        <w:t>showProfile</w:t>
-      </w:r>
-      <w:r>
-        <w:t>P</w:t>
-      </w:r>
-      <w:r>
-        <w:t>age</w:t>
-      </w:r>
-      <w:proofErr w:type="spellEnd"/>
+      <w:r>
+        <w:t xml:space="preserve"> Változott az </w:t>
+      </w:r>
+      <w:proofErr w:type="spellStart"/>
+      <w:r>
+        <w:t>appointments</w:t>
+      </w:r>
+      <w:proofErr w:type="spellEnd"/>
+      <w:r>
+        <w:t xml:space="preserve"> tábla is, itt is a motor adatai helyett </w:t>
+      </w:r>
+      <w:proofErr w:type="spellStart"/>
+      <w:r>
+        <w:t>catalog_id</w:t>
+      </w:r>
+      <w:proofErr w:type="spellEnd"/>
+      <w:r>
+        <w:t xml:space="preserve"> van. </w:t>
+      </w:r>
+    </w:p>
+    <w:p>
+      <w:r>
+        <w:t>Létrehoztam egy catalogModel.js-t, catalogController.js-</w:t>
+      </w:r>
+      <w:r>
+        <w:t>t a kellő metódusokkal, majd</w:t>
+      </w:r>
       <w:r>
         <w:t xml:space="preserve"> </w:t>
       </w:r>
-      <w:proofErr w:type="spellStart"/>
-      <w:r>
-        <w:t>renderel</w:t>
-      </w:r>
-      <w:proofErr w:type="spellEnd"/>
-      <w:r>
-        <w:t xml:space="preserve"> csak.</w:t>
+      <w:r>
+        <w:t xml:space="preserve">a bekötöttem őket a userRoutes.js-be. Ezután </w:t>
+      </w:r>
+      <w:proofErr w:type="spellStart"/>
+      <w:r>
+        <w:t>locals</w:t>
+      </w:r>
+      <w:proofErr w:type="spellEnd"/>
+      <w:r>
+        <w:t xml:space="preserve">-hoz hozzáadtam a </w:t>
+      </w:r>
+      <w:proofErr w:type="spellStart"/>
+      <w:r>
+        <w:t>categories</w:t>
+      </w:r>
+      <w:proofErr w:type="spellEnd"/>
+      <w:r>
+        <w:t xml:space="preserve"> listát. Átalakítottam a </w:t>
+      </w:r>
+      <w:proofErr w:type="spellStart"/>
+      <w:r>
+        <w:t>profile.ejs</w:t>
+      </w:r>
+      <w:proofErr w:type="spellEnd"/>
+      <w:r>
+        <w:t xml:space="preserve">-t a változónevek miatt, az </w:t>
+      </w:r>
+      <w:proofErr w:type="spellStart"/>
+      <w:r>
+        <w:t>appointmentData.ejs</w:t>
+      </w:r>
+      <w:proofErr w:type="spellEnd"/>
+      <w:r>
+        <w:t xml:space="preserve">-be az inputok helyett </w:t>
+      </w:r>
+      <w:proofErr w:type="spellStart"/>
+      <w:r>
+        <w:t>select</w:t>
+      </w:r>
+      <w:proofErr w:type="spellEnd"/>
+      <w:r>
+        <w:t xml:space="preserve">, ezzel együtt módosítani kellett a </w:t>
+      </w:r>
+      <w:proofErr w:type="spellStart"/>
+      <w:r>
+        <w:t>public</w:t>
+      </w:r>
+      <w:proofErr w:type="spellEnd"/>
+      <w:r>
+        <w:t>/</w:t>
+      </w:r>
+      <w:proofErr w:type="spellStart"/>
+      <w:r>
+        <w:t>js</w:t>
+      </w:r>
+      <w:proofErr w:type="spellEnd"/>
+      <w:r>
+        <w:t>/savedOrNotsavedBike.js-t is.</w:t>
+      </w:r>
+      <w:r>
+        <w:t xml:space="preserve"> Motor létrehozásánál a </w:t>
+      </w:r>
+      <w:proofErr w:type="spellStart"/>
+      <w:r>
+        <w:t>bikeModal.ejs</w:t>
+      </w:r>
+      <w:proofErr w:type="spellEnd"/>
+      <w:r>
+        <w:t xml:space="preserve">-t </w:t>
+      </w:r>
+      <w:proofErr w:type="spellStart"/>
+      <w:r>
+        <w:t>select-ekre</w:t>
+      </w:r>
+      <w:proofErr w:type="spellEnd"/>
+      <w:r>
+        <w:t xml:space="preserve"> és ezzel együtt a </w:t>
+      </w:r>
+      <w:proofErr w:type="spellStart"/>
+      <w:r>
+        <w:t>public</w:t>
+      </w:r>
+      <w:proofErr w:type="spellEnd"/>
+      <w:r>
+        <w:t>/</w:t>
+      </w:r>
+      <w:proofErr w:type="spellStart"/>
+      <w:r>
+        <w:t>js</w:t>
+      </w:r>
+      <w:proofErr w:type="spellEnd"/>
+      <w:r>
+        <w:t xml:space="preserve">/bikeModal.js-t. Megjelenítésnél </w:t>
+      </w:r>
+      <w:proofErr w:type="spellStart"/>
+      <w:r>
+        <w:t>admin</w:t>
+      </w:r>
+      <w:proofErr w:type="spellEnd"/>
+      <w:r>
+        <w:t xml:space="preserve"> oldalon az </w:t>
+      </w:r>
+      <w:proofErr w:type="spellStart"/>
+      <w:r>
+        <w:t>appointments.ejs</w:t>
+      </w:r>
+      <w:proofErr w:type="spellEnd"/>
+      <w:r>
+        <w:t xml:space="preserve">-t és </w:t>
+      </w:r>
+      <w:proofErr w:type="spellStart"/>
+      <w:r>
+        <w:t>userPage.ejs</w:t>
+      </w:r>
+      <w:proofErr w:type="spellEnd"/>
+      <w:r>
+        <w:t>-t.</w:t>
+      </w:r>
+    </w:p>
+    <w:p>
+      <w:r>
+        <w:t>Fontos, hogy változtak az adattáblák, így az appointmentController.js-ben, bikeController.js-ben és userController.js-ben is ennek megfelelő módosításokat kellett végrehajtani.</w:t>
       </w:r>
     </w:p>
     <w:p/>
-    <w:p/>
-    <w:p/>
-    <w:p/>
-    <w:p>
-      <w:r>
-        <w:t>-mikor viszi és mikor kell neki legkésőbb (</w:t>
-      </w:r>
-      <w:proofErr w:type="spellStart"/>
-      <w:r>
-        <w:t>raer</w:t>
-      </w:r>
-      <w:proofErr w:type="spellEnd"/>
-      <w:r>
-        <w:t xml:space="preserve"> vagy </w:t>
-      </w:r>
-      <w:proofErr w:type="spellStart"/>
-      <w:r>
-        <w:t>surgos</w:t>
-      </w:r>
-      <w:proofErr w:type="spellEnd"/>
-      <w:r>
-        <w:t>)</w:t>
-      </w:r>
-    </w:p>
-    <w:p>
-      <w:r>
-        <w:t>-</w:t>
-      </w:r>
-      <w:proofErr w:type="spellStart"/>
-      <w:r>
-        <w:t>szallitas</w:t>
-      </w:r>
-      <w:proofErr w:type="spellEnd"/>
-      <w:r>
-        <w:t xml:space="preserve"> vagy </w:t>
-      </w:r>
-      <w:proofErr w:type="spellStart"/>
-      <w:r>
-        <w:t>szemelyes</w:t>
-      </w:r>
-      <w:proofErr w:type="spellEnd"/>
-      <w:r>
-        <w:t xml:space="preserve"> </w:t>
-      </w:r>
-      <w:proofErr w:type="spellStart"/>
-      <w:r>
-        <w:t>atvetel</w:t>
-      </w:r>
-      <w:proofErr w:type="spellEnd"/>
-    </w:p>
-    <w:p>
-      <w:r>
-        <w:t xml:space="preserve">- </w:t>
-      </w:r>
-      <w:proofErr w:type="spellStart"/>
-      <w:r>
-        <w:t>megjegyzes</w:t>
-      </w:r>
-      <w:proofErr w:type="spellEnd"/>
-      <w:r>
-        <w:t xml:space="preserve"> helyett 4-5 fix </w:t>
-      </w:r>
-      <w:proofErr w:type="spellStart"/>
-      <w:r>
-        <w:t>opcio</w:t>
-      </w:r>
-      <w:proofErr w:type="spellEnd"/>
-      <w:r>
-        <w:t xml:space="preserve"> de a </w:t>
-      </w:r>
-      <w:proofErr w:type="spellStart"/>
-      <w:r>
-        <w:t>megjegyzes</w:t>
-      </w:r>
-      <w:proofErr w:type="spellEnd"/>
-      <w:r>
-        <w:t xml:space="preserve"> is ottmarad</w:t>
+    <w:p>
+      <w:pPr>
+        <w:rPr>
+          <w:b/>
+          <w:bCs/>
+        </w:rPr>
+      </w:pPr>
+      <w:r>
+        <w:rPr>
+          <w:b/>
+          <w:bCs/>
+        </w:rPr>
+        <w:t>15. #10</w:t>
+      </w:r>
+    </w:p>
+    <w:p>
+      <w:r>
+        <w:t>Ebben a feladatban az időpontfoglalás naptár részénél lesz egy opció, amit ki kell választani az alapján,</w:t>
+      </w:r>
+      <w:r>
+        <w:t xml:space="preserve"> személyesen intézi a terméket vagy szállítással, illetve </w:t>
+      </w:r>
+      <w:r>
+        <w:t xml:space="preserve">sürgős (1-3 nap) a szerviz vagy ráér (1-3 hét). </w:t>
+      </w:r>
+      <w:r>
+        <w:t xml:space="preserve">Ehhez kell majd az </w:t>
+      </w:r>
+      <w:proofErr w:type="spellStart"/>
+      <w:r>
+        <w:t>appointments</w:t>
+      </w:r>
+      <w:proofErr w:type="spellEnd"/>
+      <w:r>
+        <w:t xml:space="preserve"> táblába egy </w:t>
+      </w:r>
+      <w:proofErr w:type="spellStart"/>
+      <w:r>
+        <w:t>delivery_method</w:t>
+      </w:r>
+      <w:proofErr w:type="spellEnd"/>
+      <w:r>
+        <w:t xml:space="preserve"> és </w:t>
+      </w:r>
+      <w:proofErr w:type="spellStart"/>
+      <w:r>
+        <w:t>service_urgency</w:t>
+      </w:r>
+      <w:proofErr w:type="spellEnd"/>
+      <w:r>
+        <w:t xml:space="preserve"> nevű adattag, ami ezt a két opciót tartalmazhatja.</w:t>
+      </w:r>
+      <w:r>
+        <w:t xml:space="preserve"> Ehhez frissítenem kell az appointmentsModel.js-t, appointmentController.js-t. </w:t>
+      </w:r>
+      <w:r>
+        <w:lastRenderedPageBreak/>
+        <w:t xml:space="preserve">Felhasználói felületen a </w:t>
+      </w:r>
+      <w:proofErr w:type="spellStart"/>
+      <w:r>
+        <w:t>profile.ejs</w:t>
+      </w:r>
+      <w:proofErr w:type="spellEnd"/>
+      <w:r>
+        <w:t xml:space="preserve">-t, </w:t>
+      </w:r>
+      <w:proofErr w:type="spellStart"/>
+      <w:r>
+        <w:t>appointmentTime.ejs</w:t>
+      </w:r>
+      <w:proofErr w:type="spellEnd"/>
+      <w:r>
+        <w:t>-t</w:t>
+      </w:r>
+      <w:r>
+        <w:t xml:space="preserve">, </w:t>
+      </w:r>
+      <w:proofErr w:type="spellStart"/>
+      <w:r>
+        <w:t>admin</w:t>
+      </w:r>
+      <w:proofErr w:type="spellEnd"/>
+      <w:r>
+        <w:t>/</w:t>
+      </w:r>
+      <w:proofErr w:type="spellStart"/>
+      <w:r>
+        <w:t>userPage.ejs</w:t>
+      </w:r>
+      <w:proofErr w:type="spellEnd"/>
+      <w:r>
+        <w:t xml:space="preserve">-t, </w:t>
+      </w:r>
+      <w:proofErr w:type="spellStart"/>
+      <w:r>
+        <w:t>admin</w:t>
+      </w:r>
+      <w:proofErr w:type="spellEnd"/>
+      <w:r>
+        <w:t>/</w:t>
+      </w:r>
+      <w:proofErr w:type="spellStart"/>
+      <w:r>
+        <w:t>appointments.ejs</w:t>
+      </w:r>
+      <w:proofErr w:type="spellEnd"/>
+      <w:r>
+        <w:t>-t.</w:t>
+      </w:r>
+    </w:p>
+    <w:p>
+      <w:r>
+        <w:t xml:space="preserve">Közben észrevettem, hogy az Időpontfoglalásnál a naptár nézetben a fejléc Szolgáltatások füle szétesik, </w:t>
+      </w:r>
+      <w:r>
+        <w:t>ennek oka az volt, hogy nem volt betöltve a header.css.</w:t>
+      </w:r>
+    </w:p>
+    <w:p>
+      <w:r>
+        <w:t>Az időpontfoglalás utolsó lépésénél a megjegyzés rovat helyett 4-5 fix választható opció, de a megjegyzés lehetséges külön.</w:t>
+      </w:r>
+      <w:r>
+        <w:t xml:space="preserve"> Ehhez az </w:t>
+      </w:r>
+      <w:proofErr w:type="spellStart"/>
+      <w:r>
+        <w:t>appointmentData.ejs</w:t>
+      </w:r>
+      <w:proofErr w:type="spellEnd"/>
+      <w:r>
+        <w:t xml:space="preserve">-ben hozzá kell adnom </w:t>
+      </w:r>
+      <w:proofErr w:type="spellStart"/>
+      <w:r>
+        <w:t>select</w:t>
+      </w:r>
+      <w:proofErr w:type="spellEnd"/>
+      <w:r>
+        <w:t>-el ezeket az opciókat.</w:t>
       </w:r>
     </w:p>
     <w:p/>
@@ -3913,6 +4268,191 @@
     <w:p/>
     <w:p/>
     <w:p/>
+    <w:p/>
+    <w:p/>
+    <w:p/>
+    <w:p/>
+    <w:p/>
+    <w:p/>
+    <w:p>
+      <w:r>
+        <w:t xml:space="preserve">CREATE TABLE </w:t>
+      </w:r>
+      <w:proofErr w:type="spellStart"/>
+      <w:r>
+        <w:t>catalog</w:t>
+      </w:r>
+      <w:proofErr w:type="spellEnd"/>
+      <w:r>
+        <w:t xml:space="preserve"> (</w:t>
+      </w:r>
+    </w:p>
+    <w:p>
+      <w:r>
+        <w:t xml:space="preserve">    </w:t>
+      </w:r>
+      <w:proofErr w:type="spellStart"/>
+      <w:r>
+        <w:t>id</w:t>
+      </w:r>
+      <w:proofErr w:type="spellEnd"/>
+      <w:r>
+        <w:t xml:space="preserve"> SERIAL PRIMARY KEY,</w:t>
+      </w:r>
+    </w:p>
+    <w:p>
+      <w:r>
+        <w:t xml:space="preserve">    </w:t>
+      </w:r>
+      <w:proofErr w:type="spellStart"/>
+      <w:r>
+        <w:t>category</w:t>
+      </w:r>
+      <w:proofErr w:type="spellEnd"/>
+      <w:r>
+        <w:t xml:space="preserve"> </w:t>
+      </w:r>
+      <w:proofErr w:type="gramStart"/>
+      <w:r>
+        <w:t>VARCHAR(</w:t>
+      </w:r>
+      <w:proofErr w:type="gramEnd"/>
+      <w:r>
+        <w:t>50) NOT NULL,</w:t>
+      </w:r>
+    </w:p>
+    <w:p>
+      <w:r>
+        <w:t xml:space="preserve">    </w:t>
+      </w:r>
+      <w:proofErr w:type="spellStart"/>
+      <w:r>
+        <w:t>brand</w:t>
+      </w:r>
+      <w:proofErr w:type="spellEnd"/>
+      <w:r>
+        <w:t xml:space="preserve"> </w:t>
+      </w:r>
+      <w:proofErr w:type="gramStart"/>
+      <w:r>
+        <w:t>VARCHAR(</w:t>
+      </w:r>
+      <w:proofErr w:type="gramEnd"/>
+      <w:r>
+        <w:t>50) NOT NULL,</w:t>
+      </w:r>
+    </w:p>
+    <w:p>
+      <w:r>
+        <w:t xml:space="preserve">    </w:t>
+      </w:r>
+      <w:proofErr w:type="spellStart"/>
+      <w:r>
+        <w:t>model</w:t>
+      </w:r>
+      <w:proofErr w:type="spellEnd"/>
+      <w:r>
+        <w:t xml:space="preserve"> </w:t>
+      </w:r>
+      <w:proofErr w:type="gramStart"/>
+      <w:r>
+        <w:t>VARCHAR(</w:t>
+      </w:r>
+      <w:proofErr w:type="gramEnd"/>
+      <w:r>
+        <w:t>50) NOT NULL,</w:t>
+      </w:r>
+    </w:p>
+    <w:p>
+      <w:r>
+        <w:t xml:space="preserve">    </w:t>
+      </w:r>
+      <w:proofErr w:type="spellStart"/>
+      <w:r>
+        <w:t>cylinder</w:t>
+      </w:r>
+      <w:proofErr w:type="spellEnd"/>
+      <w:r>
+        <w:t xml:space="preserve"> INT NOT NULL,</w:t>
+      </w:r>
+    </w:p>
+    <w:p>
+      <w:r>
+        <w:t xml:space="preserve">    stroke </w:t>
+      </w:r>
+      <w:proofErr w:type="gramStart"/>
+      <w:r>
+        <w:t>VARCHAR(</w:t>
+      </w:r>
+      <w:proofErr w:type="gramEnd"/>
+      <w:r>
+        <w:t>10) NOT NULL,</w:t>
+      </w:r>
+    </w:p>
+    <w:p>
+      <w:r>
+        <w:t xml:space="preserve">    </w:t>
+      </w:r>
+      <w:proofErr w:type="spellStart"/>
+      <w:r>
+        <w:t>generation</w:t>
+      </w:r>
+      <w:proofErr w:type="spellEnd"/>
+      <w:r>
+        <w:t xml:space="preserve"> INT,</w:t>
+      </w:r>
+    </w:p>
+    <w:p>
+      <w:r>
+        <w:t xml:space="preserve">    UNIQUE (</w:t>
+      </w:r>
+      <w:proofErr w:type="spellStart"/>
+      <w:r>
+        <w:t>category</w:t>
+      </w:r>
+      <w:proofErr w:type="spellEnd"/>
+      <w:r>
+        <w:t xml:space="preserve">, </w:t>
+      </w:r>
+      <w:proofErr w:type="spellStart"/>
+      <w:r>
+        <w:t>brand</w:t>
+      </w:r>
+      <w:proofErr w:type="spellEnd"/>
+      <w:r>
+        <w:t xml:space="preserve">, </w:t>
+      </w:r>
+      <w:proofErr w:type="spellStart"/>
+      <w:r>
+        <w:t>model</w:t>
+      </w:r>
+      <w:proofErr w:type="spellEnd"/>
+      <w:r>
+        <w:t xml:space="preserve">, </w:t>
+      </w:r>
+      <w:proofErr w:type="spellStart"/>
+      <w:r>
+        <w:t>cylinder</w:t>
+      </w:r>
+      <w:proofErr w:type="spellEnd"/>
+      <w:r>
+        <w:t xml:space="preserve">, stroke, </w:t>
+      </w:r>
+      <w:proofErr w:type="spellStart"/>
+      <w:r>
+        <w:t>generation</w:t>
+      </w:r>
+      <w:proofErr w:type="spellEnd"/>
+      <w:r>
+        <w:t>)</w:t>
+      </w:r>
+    </w:p>
+    <w:p>
+      <w:r>
+        <w:t>);</w:t>
+      </w:r>
+    </w:p>
+    <w:p/>
     <w:p>
       <w:r>
         <w:lastRenderedPageBreak/>
@@ -3920,7 +4460,7 @@
       </w:r>
       <w:proofErr w:type="spellStart"/>
       <w:r>
-        <w:t>catalog</w:t>
+        <w:t>users</w:t>
       </w:r>
       <w:proofErr w:type="spellEnd"/>
       <w:r>
@@ -3929,7 +4469,7 @@
     </w:p>
     <w:p>
       <w:r>
-        <w:t xml:space="preserve">    </w:t>
+        <w:tab/>
       </w:r>
       <w:proofErr w:type="spellStart"/>
       <w:r>
@@ -3942,153 +4482,6 @@
     </w:p>
     <w:p>
       <w:r>
-        <w:t xml:space="preserve">    </w:t>
-      </w:r>
-      <w:proofErr w:type="spellStart"/>
-      <w:r>
-        <w:t>category</w:t>
-      </w:r>
-      <w:proofErr w:type="spellEnd"/>
-      <w:r>
-        <w:t xml:space="preserve"> VARCHAR(50) NOT NULL,</w:t>
-      </w:r>
-    </w:p>
-    <w:p>
-      <w:r>
-        <w:t xml:space="preserve">    </w:t>
-      </w:r>
-      <w:proofErr w:type="spellStart"/>
-      <w:r>
-        <w:t>brand</w:t>
-      </w:r>
-      <w:proofErr w:type="spellEnd"/>
-      <w:r>
-        <w:t xml:space="preserve"> VARCHAR(50) NOT NULL,</w:t>
-      </w:r>
-    </w:p>
-    <w:p>
-      <w:r>
-        <w:t xml:space="preserve">    </w:t>
-      </w:r>
-      <w:proofErr w:type="spellStart"/>
-      <w:r>
-        <w:t>model</w:t>
-      </w:r>
-      <w:proofErr w:type="spellEnd"/>
-      <w:r>
-        <w:t xml:space="preserve"> VARCHAR(50) NOT NULL,</w:t>
-      </w:r>
-    </w:p>
-    <w:p>
-      <w:r>
-        <w:t xml:space="preserve">    </w:t>
-      </w:r>
-      <w:proofErr w:type="spellStart"/>
-      <w:r>
-        <w:t>cylinder</w:t>
-      </w:r>
-      <w:proofErr w:type="spellEnd"/>
-      <w:r>
-        <w:t xml:space="preserve"> INT NOT NULL,</w:t>
-      </w:r>
-    </w:p>
-    <w:p>
-      <w:r>
-        <w:t xml:space="preserve">    stroke VARCHAR(10) NOT NULL,</w:t>
-      </w:r>
-    </w:p>
-    <w:p>
-      <w:r>
-        <w:t xml:space="preserve">    </w:t>
-      </w:r>
-      <w:proofErr w:type="spellStart"/>
-      <w:r>
-        <w:t>generation</w:t>
-      </w:r>
-      <w:proofErr w:type="spellEnd"/>
-      <w:r>
-        <w:t xml:space="preserve"> INT,</w:t>
-      </w:r>
-    </w:p>
-    <w:p>
-      <w:r>
-        <w:t xml:space="preserve">    UNIQUE (</w:t>
-      </w:r>
-      <w:proofErr w:type="spellStart"/>
-      <w:r>
-        <w:t>category</w:t>
-      </w:r>
-      <w:proofErr w:type="spellEnd"/>
-      <w:r>
-        <w:t xml:space="preserve">, </w:t>
-      </w:r>
-      <w:proofErr w:type="spellStart"/>
-      <w:r>
-        <w:t>brand</w:t>
-      </w:r>
-      <w:proofErr w:type="spellEnd"/>
-      <w:r>
-        <w:t xml:space="preserve">, </w:t>
-      </w:r>
-      <w:proofErr w:type="spellStart"/>
-      <w:r>
-        <w:t>model</w:t>
-      </w:r>
-      <w:proofErr w:type="spellEnd"/>
-      <w:r>
-        <w:t xml:space="preserve">, </w:t>
-      </w:r>
-      <w:proofErr w:type="spellStart"/>
-      <w:r>
-        <w:t>cylinder</w:t>
-      </w:r>
-      <w:proofErr w:type="spellEnd"/>
-      <w:r>
-        <w:t xml:space="preserve">, stroke, </w:t>
-      </w:r>
-      <w:proofErr w:type="spellStart"/>
-      <w:r>
-        <w:t>generation</w:t>
-      </w:r>
-      <w:proofErr w:type="spellEnd"/>
-      <w:r>
-        <w:t>)</w:t>
-      </w:r>
-    </w:p>
-    <w:p>
-      <w:r>
-        <w:t>);</w:t>
-      </w:r>
-    </w:p>
-    <w:p/>
-    <w:p>
-      <w:r>
-        <w:t xml:space="preserve">CREATE TABLE </w:t>
-      </w:r>
-      <w:proofErr w:type="spellStart"/>
-      <w:r>
-        <w:t>users</w:t>
-      </w:r>
-      <w:proofErr w:type="spellEnd"/>
-      <w:r>
-        <w:t xml:space="preserve"> (</w:t>
-      </w:r>
-    </w:p>
-    <w:p>
-      <w:r>
-        <w:tab/>
-      </w:r>
-      <w:proofErr w:type="spellStart"/>
-      <w:r>
-        <w:t>id</w:t>
-      </w:r>
-      <w:proofErr w:type="spellEnd"/>
-      <w:r>
-        <w:t xml:space="preserve"> SERIAL PRIMARY KEY,</w:t>
-      </w:r>
-    </w:p>
-    <w:p>
-      <w:r>
         <w:tab/>
       </w:r>
       <w:proofErr w:type="spellStart"/>
@@ -4097,7 +4490,15 @@
       </w:r>
       <w:proofErr w:type="spellEnd"/>
       <w:r>
-        <w:t xml:space="preserve"> VARCHAR(100) NOT NULL,</w:t>
+        <w:t xml:space="preserve"> </w:t>
+      </w:r>
+      <w:proofErr w:type="gramStart"/>
+      <w:r>
+        <w:t>VARCHAR(</w:t>
+      </w:r>
+      <w:proofErr w:type="gramEnd"/>
+      <w:r>
+        <w:t>100) NOT NULL,</w:t>
       </w:r>
     </w:p>
     <w:p>
@@ -4110,13 +4511,29 @@
       </w:r>
       <w:proofErr w:type="spellEnd"/>
       <w:r>
-        <w:t xml:space="preserve"> VARCHAR(100) NOT NULL,</w:t>
-      </w:r>
-    </w:p>
-    <w:p>
-      <w:r>
-        <w:tab/>
-        <w:t>email VARCHAR(100) NOT NULL,</w:t>
+        <w:t xml:space="preserve"> </w:t>
+      </w:r>
+      <w:proofErr w:type="gramStart"/>
+      <w:r>
+        <w:t>VARCHAR(</w:t>
+      </w:r>
+      <w:proofErr w:type="gramEnd"/>
+      <w:r>
+        <w:t>100) NOT NULL,</w:t>
+      </w:r>
+    </w:p>
+    <w:p>
+      <w:r>
+        <w:tab/>
+        <w:t xml:space="preserve">email </w:t>
+      </w:r>
+      <w:proofErr w:type="gramStart"/>
+      <w:r>
+        <w:t>VARCHAR(</w:t>
+      </w:r>
+      <w:proofErr w:type="gramEnd"/>
+      <w:r>
+        <w:t>100) NOT NULL,</w:t>
       </w:r>
     </w:p>
     <w:p>
@@ -4129,7 +4546,15 @@
       </w:r>
       <w:proofErr w:type="spellEnd"/>
       <w:r>
-        <w:t xml:space="preserve"> VARCHAR(255) NOT NULL,</w:t>
+        <w:t xml:space="preserve"> </w:t>
+      </w:r>
+      <w:proofErr w:type="gramStart"/>
+      <w:r>
+        <w:t>VARCHAR(</w:t>
+      </w:r>
+      <w:proofErr w:type="gramEnd"/>
+      <w:r>
+        <w:t>255) NOT NULL,</w:t>
       </w:r>
     </w:p>
     <w:p>
@@ -4142,7 +4567,15 @@
       </w:r>
       <w:proofErr w:type="spellEnd"/>
       <w:r>
-        <w:t xml:space="preserve"> VARCHAR(20) NOT NULL,</w:t>
+        <w:t xml:space="preserve"> </w:t>
+      </w:r>
+      <w:proofErr w:type="gramStart"/>
+      <w:r>
+        <w:t>VARCHAR(</w:t>
+      </w:r>
+      <w:proofErr w:type="gramEnd"/>
+      <w:r>
+        <w:t>20) NOT NULL,</w:t>
       </w:r>
     </w:p>
     <w:p>
@@ -4155,7 +4588,15 @@
       </w:r>
       <w:proofErr w:type="spellEnd"/>
       <w:r>
-        <w:t xml:space="preserve"> VARCHAR(30) NOT NULL,</w:t>
+        <w:t xml:space="preserve"> </w:t>
+      </w:r>
+      <w:proofErr w:type="gramStart"/>
+      <w:r>
+        <w:t>VARCHAR(</w:t>
+      </w:r>
+      <w:proofErr w:type="gramEnd"/>
+      <w:r>
+        <w:t>30) NOT NULL,</w:t>
       </w:r>
     </w:p>
     <w:p>
@@ -4213,7 +4654,15 @@
       </w:r>
       <w:proofErr w:type="spellEnd"/>
       <w:r>
-        <w:t xml:space="preserve"> VARCHAR(30) NOT NULL,</w:t>
+        <w:t xml:space="preserve"> </w:t>
+      </w:r>
+      <w:proofErr w:type="gramStart"/>
+      <w:r>
+        <w:t>VARCHAR(</w:t>
+      </w:r>
+      <w:proofErr w:type="gramEnd"/>
+      <w:r>
+        <w:t>30) NOT NULL,</w:t>
       </w:r>
     </w:p>
     <w:p>
@@ -4239,7 +4688,15 @@
       </w:r>
       <w:proofErr w:type="spellEnd"/>
       <w:r>
-        <w:t xml:space="preserve"> NUMERIC(10,2) NOT NULL,</w:t>
+        <w:t xml:space="preserve"> </w:t>
+      </w:r>
+      <w:proofErr w:type="gramStart"/>
+      <w:r>
+        <w:t>NUMERIC(</w:t>
+      </w:r>
+      <w:proofErr w:type="gramEnd"/>
+      <w:r>
+        <w:t>10,2) NOT NULL,</w:t>
       </w:r>
     </w:p>
     <w:p>
@@ -4257,29 +4714,227 @@
     </w:p>
     <w:p>
       <w:r>
+        <w:tab/>
+      </w:r>
+      <w:proofErr w:type="spellStart"/>
+      <w:r>
+        <w:t>is_active</w:t>
+      </w:r>
+      <w:proofErr w:type="spellEnd"/>
+      <w:r>
+        <w:t xml:space="preserve"> BOOLEAN NOT NULL DEFAULT </w:t>
+      </w:r>
+      <w:proofErr w:type="spellStart"/>
+      <w:r>
+        <w:t>true</w:t>
+      </w:r>
+      <w:proofErr w:type="spellEnd"/>
+      <w:r>
+        <w:t>,</w:t>
+      </w:r>
+    </w:p>
+    <w:p>
+      <w:r>
+        <w:tab/>
+      </w:r>
+      <w:proofErr w:type="spellStart"/>
+      <w:r>
+        <w:t>created_at</w:t>
+      </w:r>
+      <w:proofErr w:type="spellEnd"/>
+      <w:r>
+        <w:t xml:space="preserve"> TIMESTAMP DEFAULT CURRENT_TIMESTAMP,</w:t>
+      </w:r>
+    </w:p>
+    <w:p>
+      <w:r>
+        <w:tab/>
+      </w:r>
+      <w:proofErr w:type="spellStart"/>
+      <w:r>
+        <w:t>updated_at</w:t>
+      </w:r>
+      <w:proofErr w:type="spellEnd"/>
+      <w:r>
+        <w:t xml:space="preserve"> TIMESTAMP DEFAULT CURRENT_TIMESTAMP</w:t>
+      </w:r>
+    </w:p>
+    <w:p>
+      <w:r>
+        <w:t>);</w:t>
+      </w:r>
+    </w:p>
+    <w:p/>
+    <w:p>
+      <w:r>
+        <w:t xml:space="preserve">CREATE TABLE </w:t>
+      </w:r>
+      <w:proofErr w:type="spellStart"/>
+      <w:r>
+        <w:t>appointments</w:t>
+      </w:r>
+      <w:proofErr w:type="spellEnd"/>
+      <w:r>
+        <w:t xml:space="preserve"> (</w:t>
+      </w:r>
+    </w:p>
+    <w:p>
+      <w:r>
+        <w:t xml:space="preserve">    </w:t>
+      </w:r>
+      <w:r>
+        <w:tab/>
+      </w:r>
+      <w:proofErr w:type="spellStart"/>
+      <w:r>
+        <w:t>id</w:t>
+      </w:r>
+      <w:proofErr w:type="spellEnd"/>
+      <w:r>
+        <w:t xml:space="preserve"> SERIAL PRIMARY KEY,</w:t>
+      </w:r>
+    </w:p>
+    <w:p>
+      <w:r>
+        <w:t xml:space="preserve">   </w:t>
+      </w:r>
+      <w:r>
+        <w:tab/>
+      </w:r>
+      <w:proofErr w:type="spellStart"/>
+      <w:r>
+        <w:t>user_id</w:t>
+      </w:r>
+      <w:proofErr w:type="spellEnd"/>
+      <w:r>
+        <w:t xml:space="preserve"> INT NOT NULL,</w:t>
+      </w:r>
+    </w:p>
+    <w:p>
+      <w:r>
+        <w:tab/>
+      </w:r>
+      <w:proofErr w:type="spellStart"/>
+      <w:r>
+        <w:t>bike_id</w:t>
+      </w:r>
+      <w:proofErr w:type="spellEnd"/>
+      <w:r>
+        <w:t xml:space="preserve"> INT,</w:t>
+      </w:r>
+    </w:p>
+    <w:p>
+      <w:r>
+        <w:tab/>
+      </w:r>
+      <w:proofErr w:type="spellStart"/>
+      <w:r>
+        <w:t>appointment_date</w:t>
+      </w:r>
+      <w:proofErr w:type="spellEnd"/>
+      <w:r>
+        <w:t xml:space="preserve"> DATE NOT NULL,</w:t>
+      </w:r>
+    </w:p>
+    <w:p>
+      <w:r>
+        <w:tab/>
+      </w:r>
+      <w:proofErr w:type="spellStart"/>
+      <w:r>
+        <w:t>appointment_time</w:t>
+      </w:r>
+      <w:proofErr w:type="spellEnd"/>
+      <w:r>
+        <w:t xml:space="preserve"> TIME NOT NULL,</w:t>
+      </w:r>
+    </w:p>
+    <w:p>
+      <w:pPr>
+        <w:ind w:firstLine="708"/>
+      </w:pPr>
+      <w:proofErr w:type="spellStart"/>
+      <w:r>
         <w:lastRenderedPageBreak/>
-        <w:tab/>
-      </w:r>
-      <w:proofErr w:type="spellStart"/>
-      <w:r>
-        <w:t>is_active</w:t>
-      </w:r>
-      <w:proofErr w:type="spellEnd"/>
-      <w:r>
-        <w:t xml:space="preserve"> BOOLEAN NOT NULL DEFAULT </w:t>
-      </w:r>
-      <w:proofErr w:type="spellStart"/>
-      <w:r>
-        <w:t>true</w:t>
-      </w:r>
-      <w:proofErr w:type="spellEnd"/>
-      <w:r>
-        <w:t>,</w:t>
-      </w:r>
-    </w:p>
-    <w:p>
-      <w:r>
-        <w:tab/>
+        <w:t>delivery_method</w:t>
+      </w:r>
+      <w:proofErr w:type="spellEnd"/>
+      <w:r>
+        <w:t xml:space="preserve"> </w:t>
+      </w:r>
+      <w:proofErr w:type="gramStart"/>
+      <w:r>
+        <w:t>VARCHAR(</w:t>
+      </w:r>
+      <w:proofErr w:type="gramEnd"/>
+      <w:r>
+        <w:t>20) NOT NULL,</w:t>
+      </w:r>
+    </w:p>
+    <w:p>
+      <w:pPr>
+        <w:ind w:firstLine="708"/>
+      </w:pPr>
+      <w:proofErr w:type="spellStart"/>
+      <w:r>
+        <w:t>service_urgency</w:t>
+      </w:r>
+      <w:proofErr w:type="spellEnd"/>
+      <w:r>
+        <w:t xml:space="preserve"> </w:t>
+      </w:r>
+      <w:proofErr w:type="gramStart"/>
+      <w:r>
+        <w:t>VARCHAR(</w:t>
+      </w:r>
+      <w:proofErr w:type="gramEnd"/>
+      <w:r>
+        <w:t>20) NOT NULL,</w:t>
+      </w:r>
+    </w:p>
+    <w:p>
+      <w:r>
+        <w:tab/>
+      </w:r>
+      <w:proofErr w:type="spellStart"/>
+      <w:r>
+        <w:t>catalog_id</w:t>
+      </w:r>
+      <w:proofErr w:type="spellEnd"/>
+      <w:r>
+        <w:t xml:space="preserve"> INT NOT NULL,</w:t>
+      </w:r>
+    </w:p>
+    <w:p>
+      <w:r>
+        <w:tab/>
+      </w:r>
+      <w:proofErr w:type="spellStart"/>
+      <w:r>
+        <w:t>note</w:t>
+      </w:r>
+      <w:proofErr w:type="spellEnd"/>
+      <w:r>
+        <w:t xml:space="preserve"> TEXT,</w:t>
+      </w:r>
+    </w:p>
+    <w:p>
+      <w:r>
+        <w:tab/>
+        <w:t xml:space="preserve">status </w:t>
+      </w:r>
+      <w:proofErr w:type="gramStart"/>
+      <w:r>
+        <w:t>VARCHAR(</w:t>
+      </w:r>
+      <w:proofErr w:type="gramEnd"/>
+      <w:r>
+        <w:t>20) NOT NULL DEFAULT 'Feldolgozás alatt',</w:t>
+      </w:r>
+    </w:p>
+    <w:p>
+      <w:r>
+        <w:t xml:space="preserve">    </w:t>
       </w:r>
       <w:proofErr w:type="spellStart"/>
       <w:r>
@@ -4290,152 +4945,466 @@
         <w:t xml:space="preserve"> TIMESTAMP DEFAULT CURRENT_TIMESTAMP,</w:t>
       </w:r>
     </w:p>
-    <w:p>
-      <w:r>
-        <w:tab/>
-      </w:r>
+    <w:p/>
+    <w:p>
+      <w:r>
+        <w:tab/>
+        <w:t xml:space="preserve">CONSTRAINT </w:t>
+      </w:r>
+      <w:proofErr w:type="spellStart"/>
+      <w:r>
+        <w:t>fk_appointment_user</w:t>
+      </w:r>
+      <w:proofErr w:type="spellEnd"/>
+    </w:p>
+    <w:p>
+      <w:r>
+        <w:tab/>
+      </w:r>
+      <w:r>
+        <w:tab/>
+        <w:t>FOREIGN KEY (</w:t>
+      </w:r>
+      <w:proofErr w:type="spellStart"/>
+      <w:r>
+        <w:t>user_id</w:t>
+      </w:r>
+      <w:proofErr w:type="spellEnd"/>
+      <w:r>
+        <w:t>)</w:t>
+      </w:r>
+    </w:p>
+    <w:p>
+      <w:r>
+        <w:tab/>
+      </w:r>
+      <w:r>
+        <w:tab/>
+        <w:t xml:space="preserve">REFERENCES </w:t>
+      </w:r>
+      <w:proofErr w:type="spellStart"/>
+      <w:r>
+        <w:t>users</w:t>
+      </w:r>
+      <w:proofErr w:type="spellEnd"/>
+      <w:r>
+        <w:t>(</w:t>
+      </w:r>
+      <w:proofErr w:type="spellStart"/>
+      <w:r>
+        <w:t>id</w:t>
+      </w:r>
+      <w:proofErr w:type="spellEnd"/>
+      <w:r>
+        <w:t>)</w:t>
+      </w:r>
+    </w:p>
+    <w:p>
+      <w:r>
+        <w:tab/>
+      </w:r>
+      <w:r>
+        <w:tab/>
+        <w:t>ON DELETE CASCADE,</w:t>
+      </w:r>
+    </w:p>
+    <w:p/>
+    <w:p>
+      <w:r>
+        <w:tab/>
+        <w:t xml:space="preserve">CONSTRAINT </w:t>
+      </w:r>
+      <w:proofErr w:type="spellStart"/>
+      <w:r>
+        <w:t>fk_appointment_bike</w:t>
+      </w:r>
+      <w:proofErr w:type="spellEnd"/>
+    </w:p>
+    <w:p>
+      <w:r>
+        <w:tab/>
+      </w:r>
+      <w:r>
+        <w:tab/>
+        <w:t>FOREIGN KEY (</w:t>
+      </w:r>
+      <w:proofErr w:type="spellStart"/>
+      <w:r>
+        <w:t>bike_id</w:t>
+      </w:r>
+      <w:proofErr w:type="spellEnd"/>
+      <w:r>
+        <w:t>)</w:t>
+      </w:r>
+    </w:p>
+    <w:p>
+      <w:r>
+        <w:tab/>
+      </w:r>
+      <w:r>
+        <w:tab/>
+        <w:t xml:space="preserve">REFERENCES </w:t>
+      </w:r>
+      <w:proofErr w:type="spellStart"/>
+      <w:r>
+        <w:t>bikes</w:t>
+      </w:r>
+      <w:proofErr w:type="spellEnd"/>
+      <w:r>
+        <w:t>(</w:t>
+      </w:r>
+      <w:proofErr w:type="spellStart"/>
+      <w:r>
+        <w:t>id</w:t>
+      </w:r>
+      <w:proofErr w:type="spellEnd"/>
+      <w:r>
+        <w:t>)</w:t>
+      </w:r>
+    </w:p>
+    <w:p>
+      <w:r>
+        <w:tab/>
+      </w:r>
+      <w:r>
+        <w:tab/>
+        <w:t>ON DELETE SET NULL,</w:t>
+      </w:r>
+    </w:p>
+    <w:p/>
+    <w:p>
+      <w:r>
+        <w:tab/>
+        <w:t xml:space="preserve">CONSTRAINT </w:t>
+      </w:r>
+      <w:proofErr w:type="spellStart"/>
+      <w:r>
+        <w:t>fk_appointment_catalog</w:t>
+      </w:r>
+      <w:proofErr w:type="spellEnd"/>
+    </w:p>
+    <w:p>
+      <w:r>
+        <w:tab/>
+      </w:r>
+      <w:r>
+        <w:tab/>
+        <w:t>FOREIGN KEY (</w:t>
+      </w:r>
+      <w:proofErr w:type="spellStart"/>
+      <w:r>
+        <w:t>catalog_id</w:t>
+      </w:r>
+      <w:proofErr w:type="spellEnd"/>
+      <w:r>
+        <w:t>)</w:t>
+      </w:r>
+    </w:p>
+    <w:p>
+      <w:r>
+        <w:tab/>
+      </w:r>
+      <w:r>
+        <w:tab/>
+        <w:t xml:space="preserve">REFERENCES </w:t>
+      </w:r>
+      <w:proofErr w:type="spellStart"/>
+      <w:r>
+        <w:t>catalog</w:t>
+      </w:r>
+      <w:proofErr w:type="spellEnd"/>
+      <w:r>
+        <w:t>(</w:t>
+      </w:r>
+      <w:proofErr w:type="spellStart"/>
+      <w:r>
+        <w:t>id</w:t>
+      </w:r>
+      <w:proofErr w:type="spellEnd"/>
+      <w:r>
+        <w:t>)</w:t>
+      </w:r>
+    </w:p>
+    <w:p>
+      <w:r>
+        <w:tab/>
+      </w:r>
+      <w:r>
+        <w:tab/>
+        <w:t>ON DELETE RESTRICT</w:t>
+      </w:r>
+    </w:p>
+    <w:p>
+      <w:r>
+        <w:t>);</w:t>
+      </w:r>
+    </w:p>
+    <w:p/>
+    <w:p>
+      <w:r>
+        <w:t xml:space="preserve">CREATE TABLE </w:t>
+      </w:r>
+      <w:proofErr w:type="spellStart"/>
+      <w:r>
+        <w:t>appointment_services</w:t>
+      </w:r>
+      <w:proofErr w:type="spellEnd"/>
+      <w:r>
+        <w:t xml:space="preserve"> (</w:t>
+      </w:r>
+    </w:p>
+    <w:p>
+      <w:r>
+        <w:tab/>
+      </w:r>
+      <w:proofErr w:type="spellStart"/>
+      <w:r>
+        <w:t>id</w:t>
+      </w:r>
+      <w:proofErr w:type="spellEnd"/>
+      <w:r>
+        <w:t xml:space="preserve"> SERIAL PRIMARY KEY,</w:t>
+      </w:r>
+    </w:p>
+    <w:p>
+      <w:r>
+        <w:tab/>
+      </w:r>
+      <w:proofErr w:type="spellStart"/>
+      <w:r>
+        <w:t>appointment_id</w:t>
+      </w:r>
+      <w:proofErr w:type="spellEnd"/>
+      <w:r>
+        <w:t xml:space="preserve"> INT NOT NULL,</w:t>
+      </w:r>
+    </w:p>
+    <w:p>
+      <w:r>
+        <w:tab/>
+      </w:r>
+      <w:proofErr w:type="spellStart"/>
+      <w:r>
+        <w:t>service_id</w:t>
+      </w:r>
+      <w:proofErr w:type="spellEnd"/>
+      <w:r>
+        <w:t xml:space="preserve"> INT NOT NULL,</w:t>
+      </w:r>
+    </w:p>
+    <w:p/>
+    <w:p>
+      <w:r>
+        <w:lastRenderedPageBreak/>
+        <w:tab/>
+        <w:t xml:space="preserve">CONSTRAINT </w:t>
+      </w:r>
+      <w:proofErr w:type="spellStart"/>
+      <w:r>
+        <w:t>fk_appointment_services_appointment</w:t>
+      </w:r>
+      <w:proofErr w:type="spellEnd"/>
+    </w:p>
+    <w:p>
+      <w:r>
+        <w:tab/>
+      </w:r>
+      <w:r>
+        <w:tab/>
+        <w:t>FOREIGN KEY (</w:t>
+      </w:r>
+      <w:proofErr w:type="spellStart"/>
+      <w:r>
+        <w:t>appointment_id</w:t>
+      </w:r>
+      <w:proofErr w:type="spellEnd"/>
+      <w:r>
+        <w:t>)</w:t>
+      </w:r>
+    </w:p>
+    <w:p>
+      <w:r>
+        <w:tab/>
+      </w:r>
+      <w:r>
+        <w:tab/>
+        <w:t xml:space="preserve">REFERENCES </w:t>
+      </w:r>
+      <w:proofErr w:type="spellStart"/>
+      <w:r>
+        <w:t>appointments</w:t>
+      </w:r>
+      <w:proofErr w:type="spellEnd"/>
+      <w:r>
+        <w:t>(</w:t>
+      </w:r>
+      <w:proofErr w:type="spellStart"/>
+      <w:r>
+        <w:t>id</w:t>
+      </w:r>
+      <w:proofErr w:type="spellEnd"/>
+      <w:r>
+        <w:t>)</w:t>
+      </w:r>
+    </w:p>
+    <w:p>
+      <w:r>
+        <w:tab/>
+      </w:r>
+      <w:r>
+        <w:tab/>
+        <w:t>ON DELETE CASCADE,</w:t>
+      </w:r>
+    </w:p>
+    <w:p/>
+    <w:p>
+      <w:r>
+        <w:tab/>
+        <w:t xml:space="preserve">CONSTRAINT </w:t>
+      </w:r>
+      <w:proofErr w:type="spellStart"/>
+      <w:r>
+        <w:t>fk_appointment_services_services</w:t>
+      </w:r>
+      <w:proofErr w:type="spellEnd"/>
+    </w:p>
+    <w:p>
+      <w:r>
+        <w:tab/>
+      </w:r>
+      <w:r>
+        <w:tab/>
+        <w:t>FOREIGN KEY (</w:t>
+      </w:r>
+      <w:proofErr w:type="spellStart"/>
+      <w:r>
+        <w:t>service_id</w:t>
+      </w:r>
+      <w:proofErr w:type="spellEnd"/>
+      <w:r>
+        <w:t>)</w:t>
+      </w:r>
+    </w:p>
+    <w:p>
+      <w:r>
+        <w:tab/>
+      </w:r>
+      <w:r>
+        <w:tab/>
+        <w:t xml:space="preserve">REFERENCES </w:t>
+      </w:r>
+      <w:proofErr w:type="spellStart"/>
+      <w:r>
+        <w:t>services</w:t>
+      </w:r>
+      <w:proofErr w:type="spellEnd"/>
+      <w:r>
+        <w:t>(</w:t>
+      </w:r>
+      <w:proofErr w:type="spellStart"/>
+      <w:r>
+        <w:t>id</w:t>
+      </w:r>
+      <w:proofErr w:type="spellEnd"/>
+      <w:r>
+        <w:t>)</w:t>
+      </w:r>
+    </w:p>
+    <w:p>
+      <w:r>
+        <w:tab/>
+      </w:r>
+      <w:r>
+        <w:tab/>
+        <w:t>ON DELETE CASCADE</w:t>
+      </w:r>
+    </w:p>
+    <w:p>
+      <w:r>
+        <w:t>);</w:t>
+      </w:r>
+    </w:p>
+    <w:p/>
+    <w:p>
+      <w:r>
+        <w:t xml:space="preserve">CREATE TABLE </w:t>
+      </w:r>
+      <w:proofErr w:type="spellStart"/>
+      <w:r>
+        <w:t>bikes</w:t>
+      </w:r>
+      <w:proofErr w:type="spellEnd"/>
+      <w:r>
+        <w:t xml:space="preserve"> (</w:t>
+      </w:r>
+    </w:p>
+    <w:p>
+      <w:r>
+        <w:t xml:space="preserve">    </w:t>
+      </w:r>
+      <w:proofErr w:type="spellStart"/>
+      <w:r>
+        <w:t>id</w:t>
+      </w:r>
+      <w:proofErr w:type="spellEnd"/>
+      <w:r>
+        <w:t xml:space="preserve"> SERIAL PRIMARY KEY,</w:t>
+      </w:r>
+    </w:p>
+    <w:p>
+      <w:r>
+        <w:t xml:space="preserve">    </w:t>
+      </w:r>
+      <w:proofErr w:type="spellStart"/>
+      <w:r>
+        <w:t>user_id</w:t>
+      </w:r>
+      <w:proofErr w:type="spellEnd"/>
+      <w:r>
+        <w:t xml:space="preserve"> INT NOT NULL,</w:t>
+      </w:r>
+    </w:p>
+    <w:p>
+      <w:r>
+        <w:t xml:space="preserve">    </w:t>
+      </w:r>
+      <w:proofErr w:type="spellStart"/>
+      <w:r>
+        <w:t>catalog_id</w:t>
+      </w:r>
+      <w:proofErr w:type="spellEnd"/>
+      <w:r>
+        <w:t xml:space="preserve"> INT NOT NULL,</w:t>
+      </w:r>
+    </w:p>
+    <w:p>
+      <w:r>
+        <w:t xml:space="preserve">    </w:t>
+      </w:r>
+      <w:proofErr w:type="spellStart"/>
+      <w:r>
+        <w:t>created_at</w:t>
+      </w:r>
+      <w:proofErr w:type="spellEnd"/>
+      <w:r>
+        <w:t xml:space="preserve"> TIMESTAMP DEFAULT CURRENT_TIMESTAMP,</w:t>
+      </w:r>
+    </w:p>
+    <w:p>
       <w:proofErr w:type="spellStart"/>
       <w:r>
         <w:t>updated_at</w:t>
       </w:r>
       <w:proofErr w:type="spellEnd"/>
       <w:r>
-        <w:t xml:space="preserve"> TIMESTAMP DEFAULT CURRENT_TIMESTAMP</w:t>
-      </w:r>
-    </w:p>
-    <w:p>
-      <w:r>
-        <w:t>);</w:t>
-      </w:r>
-    </w:p>
-    <w:p/>
-    <w:p>
-      <w:r>
-        <w:t xml:space="preserve">CREATE TABLE </w:t>
-      </w:r>
-      <w:proofErr w:type="spellStart"/>
-      <w:r>
-        <w:t>appointments</w:t>
-      </w:r>
-      <w:proofErr w:type="spellEnd"/>
-      <w:r>
-        <w:t xml:space="preserve"> (</w:t>
-      </w:r>
-    </w:p>
-    <w:p>
-      <w:r>
-        <w:t xml:space="preserve">    </w:t>
-      </w:r>
-      <w:proofErr w:type="spellStart"/>
-      <w:r>
-        <w:t>id</w:t>
-      </w:r>
-      <w:proofErr w:type="spellEnd"/>
-      <w:r>
-        <w:t xml:space="preserve"> SERIAL PRIMARY KEY,</w:t>
-      </w:r>
-    </w:p>
-    <w:p>
-      <w:r>
-        <w:t xml:space="preserve">   </w:t>
-      </w:r>
-      <w:r>
-        <w:tab/>
-      </w:r>
-      <w:proofErr w:type="spellStart"/>
-      <w:r>
-        <w:t>user_id</w:t>
-      </w:r>
-      <w:proofErr w:type="spellEnd"/>
-      <w:r>
-        <w:t xml:space="preserve"> INT NOT NULL,</w:t>
-      </w:r>
-    </w:p>
-    <w:p>
-      <w:r>
-        <w:tab/>
-      </w:r>
-      <w:proofErr w:type="spellStart"/>
-      <w:r>
-        <w:t>bike_id</w:t>
-      </w:r>
-      <w:proofErr w:type="spellEnd"/>
-      <w:r>
-        <w:t xml:space="preserve"> INT,</w:t>
-      </w:r>
-    </w:p>
-    <w:p>
-      <w:r>
-        <w:tab/>
-      </w:r>
-      <w:proofErr w:type="spellStart"/>
-      <w:r>
-        <w:t>appointment_date</w:t>
-      </w:r>
-      <w:proofErr w:type="spellEnd"/>
-      <w:r>
-        <w:t xml:space="preserve"> DATE NOT NULL,</w:t>
-      </w:r>
-    </w:p>
-    <w:p>
-      <w:r>
-        <w:tab/>
-      </w:r>
-      <w:proofErr w:type="spellStart"/>
-      <w:r>
-        <w:t>appointment_time</w:t>
-      </w:r>
-      <w:proofErr w:type="spellEnd"/>
-      <w:r>
-        <w:t xml:space="preserve"> TIME NOT NULL,</w:t>
-      </w:r>
-    </w:p>
-    <w:p>
-      <w:r>
-        <w:tab/>
-      </w:r>
-      <w:proofErr w:type="spellStart"/>
-      <w:r>
-        <w:t>catalog_id</w:t>
-      </w:r>
-      <w:proofErr w:type="spellEnd"/>
-      <w:r>
-        <w:t xml:space="preserve"> INT NOT NULL,</w:t>
-      </w:r>
-    </w:p>
-    <w:p>
-      <w:r>
-        <w:tab/>
-      </w:r>
-      <w:proofErr w:type="spellStart"/>
-      <w:r>
-        <w:t>note</w:t>
-      </w:r>
-      <w:proofErr w:type="spellEnd"/>
-      <w:r>
-        <w:t xml:space="preserve"> TEXT,</w:t>
-      </w:r>
-    </w:p>
-    <w:p>
-      <w:r>
-        <w:tab/>
-        <w:t>status VARCHAR(20) NOT NULL DEFAULT 'Feldolgozás alatt',</w:t>
-      </w:r>
-    </w:p>
-    <w:p>
-      <w:r>
-        <w:t xml:space="preserve">    </w:t>
-      </w:r>
-      <w:proofErr w:type="spellStart"/>
-      <w:r>
-        <w:t>created_at</w:t>
-      </w:r>
-      <w:proofErr w:type="spellEnd"/>
-      <w:r>
         <w:t xml:space="preserve"> TIMESTAMP DEFAULT CURRENT_TIMESTAMP,</w:t>
       </w:r>
     </w:p>
-    <w:p/>
+    <w:p>
+      <w:r>
+        <w:tab/>
+      </w:r>
+    </w:p>
     <w:p>
       <w:r>
         <w:tab/>
@@ -4443,472 +5412,12 @@
       </w:r>
       <w:proofErr w:type="spellStart"/>
       <w:r>
-        <w:t>fk_appointment_user</w:t>
-      </w:r>
-      <w:proofErr w:type="spellEnd"/>
-    </w:p>
-    <w:p>
-      <w:r>
-        <w:tab/>
-      </w:r>
-      <w:r>
-        <w:tab/>
-        <w:t>FOREIGN KEY (</w:t>
-      </w:r>
-      <w:proofErr w:type="spellStart"/>
-      <w:r>
-        <w:t>user_id</w:t>
-      </w:r>
-      <w:proofErr w:type="spellEnd"/>
-      <w:r>
-        <w:t>)</w:t>
-      </w:r>
-    </w:p>
-    <w:p>
-      <w:r>
-        <w:tab/>
-      </w:r>
-      <w:r>
-        <w:tab/>
-        <w:t xml:space="preserve">REFERENCES </w:t>
-      </w:r>
-      <w:proofErr w:type="spellStart"/>
-      <w:r>
-        <w:t>users</w:t>
-      </w:r>
-      <w:proofErr w:type="spellEnd"/>
-      <w:r>
-        <w:t>(</w:t>
-      </w:r>
-      <w:proofErr w:type="spellStart"/>
-      <w:r>
-        <w:t>id</w:t>
-      </w:r>
-      <w:proofErr w:type="spellEnd"/>
-      <w:r>
-        <w:t>)</w:t>
-      </w:r>
-    </w:p>
-    <w:p>
-      <w:r>
-        <w:tab/>
-      </w:r>
-      <w:r>
-        <w:tab/>
-        <w:t>ON DELETE CASCADE,</w:t>
-      </w:r>
-    </w:p>
-    <w:p/>
-    <w:p>
-      <w:r>
-        <w:tab/>
-        <w:t xml:space="preserve">CONSTRAINT </w:t>
-      </w:r>
-      <w:proofErr w:type="spellStart"/>
-      <w:r>
-        <w:t>fk_appointment_bike</w:t>
-      </w:r>
-      <w:proofErr w:type="spellEnd"/>
-    </w:p>
-    <w:p>
-      <w:r>
-        <w:tab/>
-      </w:r>
-      <w:r>
-        <w:tab/>
-        <w:t>FOREIGN KEY (</w:t>
-      </w:r>
-      <w:proofErr w:type="spellStart"/>
-      <w:r>
-        <w:t>bike_id</w:t>
-      </w:r>
-      <w:proofErr w:type="spellEnd"/>
-      <w:r>
-        <w:t>)</w:t>
-      </w:r>
-    </w:p>
-    <w:p>
-      <w:r>
-        <w:tab/>
-      </w:r>
-      <w:r>
-        <w:tab/>
-        <w:t xml:space="preserve">REFERENCES </w:t>
-      </w:r>
-      <w:proofErr w:type="spellStart"/>
-      <w:r>
-        <w:t>bikes</w:t>
-      </w:r>
-      <w:proofErr w:type="spellEnd"/>
-      <w:r>
-        <w:t>(</w:t>
-      </w:r>
-      <w:proofErr w:type="spellStart"/>
-      <w:r>
-        <w:t>id</w:t>
-      </w:r>
-      <w:proofErr w:type="spellEnd"/>
-      <w:r>
-        <w:t>)</w:t>
-      </w:r>
-    </w:p>
-    <w:p>
-      <w:r>
-        <w:tab/>
-      </w:r>
-      <w:r>
-        <w:tab/>
-        <w:t>ON DELETE SET NULL,</w:t>
-      </w:r>
-    </w:p>
-    <w:p/>
-    <w:p>
-      <w:r>
-        <w:tab/>
-        <w:t xml:space="preserve">CONSTRAINT </w:t>
-      </w:r>
-      <w:proofErr w:type="spellStart"/>
-      <w:r>
-        <w:t>fk_appointment_catalog</w:t>
-      </w:r>
-      <w:proofErr w:type="spellEnd"/>
-    </w:p>
-    <w:p>
-      <w:r>
-        <w:tab/>
-      </w:r>
-      <w:r>
-        <w:tab/>
-        <w:t>FOREIGN KEY (</w:t>
-      </w:r>
-      <w:proofErr w:type="spellStart"/>
-      <w:r>
-        <w:t>catalog_id</w:t>
-      </w:r>
-      <w:proofErr w:type="spellEnd"/>
-      <w:r>
-        <w:t>)</w:t>
-      </w:r>
-    </w:p>
-    <w:p>
-      <w:r>
-        <w:lastRenderedPageBreak/>
-        <w:tab/>
-      </w:r>
-      <w:r>
-        <w:tab/>
-        <w:t xml:space="preserve">REFERENCES </w:t>
-      </w:r>
-      <w:proofErr w:type="spellStart"/>
-      <w:r>
-        <w:t>catalog</w:t>
-      </w:r>
-      <w:proofErr w:type="spellEnd"/>
-      <w:r>
-        <w:t>(</w:t>
-      </w:r>
-      <w:proofErr w:type="spellStart"/>
-      <w:r>
-        <w:t>id</w:t>
-      </w:r>
-      <w:proofErr w:type="spellEnd"/>
-      <w:r>
-        <w:t>)</w:t>
-      </w:r>
-    </w:p>
-    <w:p>
-      <w:r>
-        <w:tab/>
-      </w:r>
-      <w:r>
-        <w:tab/>
-        <w:t>ON DELETE RESTRICT</w:t>
-      </w:r>
-    </w:p>
-    <w:p>
-      <w:r>
-        <w:t>);</w:t>
-      </w:r>
-    </w:p>
-    <w:p/>
-    <w:p>
-      <w:r>
-        <w:t xml:space="preserve">CREATE TABLE </w:t>
-      </w:r>
-      <w:proofErr w:type="spellStart"/>
-      <w:r>
-        <w:t>appointment_services</w:t>
-      </w:r>
-      <w:proofErr w:type="spellEnd"/>
-      <w:r>
-        <w:t xml:space="preserve"> (</w:t>
-      </w:r>
-    </w:p>
-    <w:p>
-      <w:r>
-        <w:tab/>
-      </w:r>
-      <w:proofErr w:type="spellStart"/>
-      <w:r>
-        <w:t>id</w:t>
-      </w:r>
-      <w:proofErr w:type="spellEnd"/>
-      <w:r>
-        <w:t xml:space="preserve"> SERIAL PRIMARY KEY,</w:t>
-      </w:r>
-    </w:p>
-    <w:p>
-      <w:r>
-        <w:tab/>
-      </w:r>
-      <w:proofErr w:type="spellStart"/>
-      <w:r>
-        <w:t>appointment_id</w:t>
-      </w:r>
-      <w:proofErr w:type="spellEnd"/>
-      <w:r>
-        <w:t xml:space="preserve"> INT NOT NULL,</w:t>
-      </w:r>
-    </w:p>
-    <w:p>
-      <w:r>
-        <w:tab/>
-      </w:r>
-      <w:proofErr w:type="spellStart"/>
-      <w:r>
-        <w:t>service_id</w:t>
-      </w:r>
-      <w:proofErr w:type="spellEnd"/>
-      <w:r>
-        <w:t xml:space="preserve"> INT NOT NULL,</w:t>
-      </w:r>
-    </w:p>
-    <w:p/>
-    <w:p>
-      <w:r>
-        <w:tab/>
-        <w:t xml:space="preserve">CONSTRAINT </w:t>
-      </w:r>
-      <w:proofErr w:type="spellStart"/>
-      <w:r>
-        <w:t>fk_appointment_services_appointment</w:t>
-      </w:r>
-      <w:proofErr w:type="spellEnd"/>
-    </w:p>
-    <w:p>
-      <w:r>
-        <w:tab/>
-      </w:r>
-      <w:r>
-        <w:tab/>
-        <w:t>FOREIGN KEY (</w:t>
-      </w:r>
-      <w:proofErr w:type="spellStart"/>
-      <w:r>
-        <w:t>appointment_id</w:t>
-      </w:r>
-      <w:proofErr w:type="spellEnd"/>
-      <w:r>
-        <w:t>)</w:t>
-      </w:r>
-    </w:p>
-    <w:p>
-      <w:r>
-        <w:tab/>
-      </w:r>
-      <w:r>
-        <w:tab/>
-        <w:t xml:space="preserve">REFERENCES </w:t>
-      </w:r>
-      <w:proofErr w:type="spellStart"/>
-      <w:r>
-        <w:t>appointments</w:t>
-      </w:r>
-      <w:proofErr w:type="spellEnd"/>
-      <w:r>
-        <w:t>(</w:t>
-      </w:r>
-      <w:proofErr w:type="spellStart"/>
-      <w:r>
-        <w:t>id</w:t>
-      </w:r>
-      <w:proofErr w:type="spellEnd"/>
-      <w:r>
-        <w:t>)</w:t>
-      </w:r>
-    </w:p>
-    <w:p>
-      <w:r>
-        <w:tab/>
-      </w:r>
-      <w:r>
-        <w:tab/>
-        <w:t>ON DELETE CASCADE,</w:t>
-      </w:r>
-    </w:p>
-    <w:p/>
-    <w:p>
-      <w:r>
-        <w:tab/>
-        <w:t xml:space="preserve">CONSTRAINT </w:t>
-      </w:r>
-      <w:proofErr w:type="spellStart"/>
-      <w:r>
-        <w:t>fk_appointment_services_services</w:t>
-      </w:r>
-      <w:proofErr w:type="spellEnd"/>
-    </w:p>
-    <w:p>
-      <w:r>
-        <w:tab/>
-      </w:r>
-      <w:r>
-        <w:tab/>
-        <w:t>FOREIGN KEY (</w:t>
-      </w:r>
-      <w:proofErr w:type="spellStart"/>
-      <w:r>
-        <w:t>service_id</w:t>
-      </w:r>
-      <w:proofErr w:type="spellEnd"/>
-      <w:r>
-        <w:t>)</w:t>
-      </w:r>
-    </w:p>
-    <w:p>
-      <w:r>
-        <w:tab/>
-      </w:r>
-      <w:r>
-        <w:tab/>
-        <w:t xml:space="preserve">REFERENCES </w:t>
-      </w:r>
-      <w:proofErr w:type="spellStart"/>
-      <w:r>
-        <w:t>services</w:t>
-      </w:r>
-      <w:proofErr w:type="spellEnd"/>
-      <w:r>
-        <w:t>(</w:t>
-      </w:r>
-      <w:proofErr w:type="spellStart"/>
-      <w:r>
-        <w:t>id</w:t>
-      </w:r>
-      <w:proofErr w:type="spellEnd"/>
-      <w:r>
-        <w:t>)</w:t>
-      </w:r>
-    </w:p>
-    <w:p>
-      <w:r>
-        <w:tab/>
-      </w:r>
-      <w:r>
-        <w:tab/>
-        <w:t>ON DELETE CASCADE</w:t>
-      </w:r>
-    </w:p>
-    <w:p>
-      <w:r>
-        <w:t>);</w:t>
-      </w:r>
-    </w:p>
-    <w:p/>
-    <w:p>
-      <w:r>
-        <w:t xml:space="preserve">CREATE TABLE </w:t>
-      </w:r>
-      <w:proofErr w:type="spellStart"/>
-      <w:r>
-        <w:t>bikes</w:t>
-      </w:r>
-      <w:proofErr w:type="spellEnd"/>
-      <w:r>
-        <w:t xml:space="preserve"> (</w:t>
-      </w:r>
-    </w:p>
-    <w:p>
-      <w:r>
-        <w:t xml:space="preserve">    </w:t>
-      </w:r>
-      <w:proofErr w:type="spellStart"/>
-      <w:r>
-        <w:t>id</w:t>
-      </w:r>
-      <w:proofErr w:type="spellEnd"/>
-      <w:r>
-        <w:t xml:space="preserve"> SERIAL PRIMARY KEY,</w:t>
-      </w:r>
-    </w:p>
-    <w:p>
-      <w:r>
-        <w:t xml:space="preserve">    </w:t>
-      </w:r>
-      <w:proofErr w:type="spellStart"/>
-      <w:r>
-        <w:t>user_id</w:t>
-      </w:r>
-      <w:proofErr w:type="spellEnd"/>
-      <w:r>
-        <w:t xml:space="preserve"> INT NOT NULL,</w:t>
-      </w:r>
-    </w:p>
-    <w:p>
-      <w:r>
-        <w:t xml:space="preserve">    </w:t>
-      </w:r>
-      <w:proofErr w:type="spellStart"/>
-      <w:r>
-        <w:t>catalog_id</w:t>
-      </w:r>
-      <w:proofErr w:type="spellEnd"/>
-      <w:r>
-        <w:t xml:space="preserve"> INT NOT NULL,</w:t>
-      </w:r>
-    </w:p>
-    <w:p>
-      <w:r>
-        <w:t xml:space="preserve">    </w:t>
-      </w:r>
-      <w:proofErr w:type="spellStart"/>
-      <w:r>
-        <w:t>created_at</w:t>
-      </w:r>
-      <w:proofErr w:type="spellEnd"/>
-      <w:r>
-        <w:t xml:space="preserve"> TIMESTAMP DEFAULT CURRENT_TIMESTAMP,</w:t>
-      </w:r>
-    </w:p>
-    <w:p>
-      <w:proofErr w:type="spellStart"/>
-      <w:r>
-        <w:t>updated_at</w:t>
-      </w:r>
-      <w:proofErr w:type="spellEnd"/>
-      <w:r>
-        <w:t xml:space="preserve"> TIMESTAMP DEFAULT CURRENT_TIMESTAMP,</w:t>
-      </w:r>
-    </w:p>
-    <w:p>
-      <w:r>
-        <w:tab/>
-      </w:r>
-    </w:p>
-    <w:p>
-      <w:r>
-        <w:tab/>
-        <w:t xml:space="preserve">CONSTRAINT </w:t>
-      </w:r>
-      <w:proofErr w:type="spellStart"/>
-      <w:r>
         <w:t>fk_bike_user</w:t>
       </w:r>
       <w:proofErr w:type="spellEnd"/>
     </w:p>
     <w:p>
       <w:r>
-        <w:lastRenderedPageBreak/>
         <w:t xml:space="preserve">    </w:t>
       </w:r>
       <w:r>

</xml_diff>